<commit_message>
docs: macOS first-open flow via Privacy & Security > Open Anyway
</commit_message>
<xml_diff>
--- a/docs/Cuptick Installation Guide - TH v1.0.docx
+++ b/docs/Cuptick Installation Guide - TH v1.0.docx
@@ -1712,7 +1712,7 @@
           <w:szCs w:val="22"/>
           <w:bCs w:val="1"/>
         </w:rPr>
-        <w:t>ถ้าขึ้นหน้าเตือนว่าเปิดไม่ได้เพราะเป็นนักพัฒนาที่ไม่รู้จัก ให้ปิดหน้าเตือน แล้วคลิกขวาที่ไฟล์ .pkg → เปิด (Open) → เปิด อีกครั้ง</w:t>
+        <w:t>จะขึ้นหน้าต่างเตือนว่า Apple ไม่สามารถตรวจสอบแอปได้ (ภาพที่ 7) — กด Done ปิดหน้าต่างเตือนไปก่อน ยังไม่ต้องทำอย่างอื่น</w:t>
       </w:r>
     </w:p>
     <w:p>
@@ -1729,6 +1729,82 @@
           <w:bCs w:val="1"/>
         </w:rPr>
         <w:t xml:space="preserve">ขั้นตอนที่ 2 — </w:t>
+      </w:r>
+      <w:r>
+        <w:rPr>
+          <w:b w:val="0"/>
+          <w:color w:val="374151"/>
+          <w:sz w:val="22"/>
+          <w:rFonts w:ascii="IBM Plex Sans Thai" w:hAnsi="IBM Plex Sans Thai" w:cs="IBM Plex Sans Thai"/>
+          <w:szCs w:val="22"/>
+          <w:bCs w:val="1"/>
+        </w:rPr>
+        <w:t xml:space="preserve">ไปเปิดสิทธิ์ที่ System Settings </w:t>
+      </w:r>
+      <w:r>
+        <w:rPr>
+          <w:b w:val="0"/>
+          <w:color w:val="374151"/>
+          <w:sz w:val="22"/>
+          <w:rFonts w:ascii="IBM Plex Sans Thai" w:hAnsi="IBM Plex Sans Thai" w:cs="IBM Plex Sans Thai"/>
+          <w:szCs w:val="22"/>
+          <w:bCs w:val="1"/>
+        </w:rPr>
+        <w:t>ไปที่ System Settings → Privacy &amp; Security เลื่อนลงล่างสุด จะเห็นข้อความว่า “Cuptick” ถูกบล็อกจากการใช้งาน (ภาพที่ 8) — กด Open Anyway แล้วยืนยันด้วยรหัสผ่านเครื่องหรือ Touch ID</w:t>
+      </w:r>
+    </w:p>
+    <w:p>
+      <w:pPr>
+        <w:spacing w:after="80" w:line="324" w:lineRule="auto"/>
+      </w:pPr>
+      <w:r>
+        <w:rPr>
+          <w:b w:val="1"/>
+          <w:color w:val="374151"/>
+          <w:sz w:val="22"/>
+          <w:rFonts w:ascii="IBM Plex Sans Thai" w:hAnsi="IBM Plex Sans Thai" w:cs="IBM Plex Sans Thai"/>
+          <w:szCs w:val="22"/>
+          <w:bCs w:val="1"/>
+        </w:rPr>
+        <w:t xml:space="preserve">ขั้นตอนที่ 3 — </w:t>
+      </w:r>
+      <w:r>
+        <w:rPr>
+          <w:b w:val="0"/>
+          <w:color w:val="374151"/>
+          <w:sz w:val="22"/>
+          <w:rFonts w:ascii="IBM Plex Sans Thai" w:hAnsi="IBM Plex Sans Thai" w:cs="IBM Plex Sans Thai"/>
+          <w:szCs w:val="22"/>
+          <w:bCs w:val="1"/>
+        </w:rPr>
+        <w:t xml:space="preserve">ติดตั้งตามปกติ </w:t>
+      </w:r>
+      <w:r>
+        <w:rPr>
+          <w:b w:val="0"/>
+          <w:color w:val="374151"/>
+          <w:sz w:val="22"/>
+          <w:rFonts w:ascii="IBM Plex Sans Thai" w:hAnsi="IBM Plex Sans Thai" w:cs="IBM Plex Sans Thai"/>
+          <w:szCs w:val="22"/>
+          <w:bCs w:val="1"/>
+        </w:rPr>
+        <w:t>หน้าต่างติดตั้งจะเปิดขึ้นมา กด ดำเนินการต่อ แล้วทำตามขั้นตอนถัดไปด้านล่าง</w:t>
+      </w:r>
+    </w:p>
+    <w:p>
+      <w:pPr>
+        <w:spacing w:after="80" w:line="324" w:lineRule="auto"/>
+      </w:pPr>
+      <w:r>
+        <w:rPr>
+          <w:b w:val="1"/>
+          <w:color w:val="374151"/>
+          <w:sz w:val="22"/>
+          <w:rFonts w:ascii="IBM Plex Sans Thai" w:hAnsi="IBM Plex Sans Thai" w:cs="IBM Plex Sans Thai"/>
+          <w:szCs w:val="22"/>
+          <w:bCs w:val="1"/>
+        </w:rPr>
+        <w:t xml:space="preserve">ขั้นตอนที่ 4 — </w:t>
       </w:r>
       <w:r>
         <w:rPr>
@@ -1766,7 +1842,7 @@
           <w:szCs w:val="22"/>
           <w:bCs w:val="1"/>
         </w:rPr>
-        <w:t xml:space="preserve">ขั้นตอนที่ 3 — </w:t>
+        <w:t xml:space="preserve">ขั้นตอนที่ 5 — </w:t>
       </w:r>
       <w:r>
         <w:rPr>
@@ -1804,7 +1880,7 @@
           <w:szCs w:val="22"/>
           <w:bCs w:val="1"/>
         </w:rPr>
-        <w:t xml:space="preserve">ขั้นตอนที่ 4 — </w:t>
+        <w:t xml:space="preserve">ขั้นตอนที่ 6 — </w:t>
       </w:r>
       <w:r>
         <w:rPr>
@@ -1842,7 +1918,7 @@
           <w:szCs w:val="22"/>
           <w:bCs w:val="1"/>
         </w:rPr>
-        <w:t xml:space="preserve">ขั้นตอนที่ 5 — </w:t>
+        <w:t xml:space="preserve">ขั้นตอนที่ 7 — </w:t>
       </w:r>
       <w:r>
         <w:rPr>
@@ -1875,7 +1951,7 @@
       <w:r>
         <w:drawing>
           <wp:inline xmlns:a="http://schemas.openxmlformats.org/drawingml/2006/main" xmlns:pic="http://schemas.openxmlformats.org/drawingml/2006/picture">
-            <wp:extent cx="3474720" cy="1695994"/>
+            <wp:extent cx="3474720" cy="1535341"/>
             <wp:docPr id="7" name="Picture 7"/>
             <wp:cNvGraphicFramePr>
               <a:graphicFrameLocks noChangeAspect="1"/>
@@ -1896,7 +1972,7 @@
                   <pic:spPr>
                     <a:xfrm>
                       <a:off x="0" y="0"/>
-                      <a:ext cx="3474720" cy="1695994"/>
+                      <a:ext cx="3474720" cy="1535341"/>
                     </a:xfrm>
                     <a:prstGeom prst="rect"/>
                   </pic:spPr>
@@ -1921,7 +1997,7 @@
           <w:szCs w:val="18"/>
           <w:bCs w:val="1"/>
         </w:rPr>
-        <w:t>ภาพที่ 7  หน้าเตือนครั้งแรก — ปิด แล้วคลิกขวาที่ไฟล์ เลือก เปิด (ภาพจำลอง)</w:t>
+        <w:t>ภาพที่ 7  ดับเบิลคลิกไฟล์ .pkg แล้วกด Done (ภาพจำลอง)</w:t>
       </w:r>
     </w:p>
     <w:p>
@@ -1932,7 +2008,7 @@
       <w:r>
         <w:drawing>
           <wp:inline xmlns:a="http://schemas.openxmlformats.org/drawingml/2006/main" xmlns:pic="http://schemas.openxmlformats.org/drawingml/2006/picture">
-            <wp:extent cx="4572000" cy="3265714"/>
+            <wp:extent cx="4937760" cy="3240405"/>
             <wp:docPr id="8" name="Picture 8"/>
             <wp:cNvGraphicFramePr>
               <a:graphicFrameLocks noChangeAspect="1"/>
@@ -1941,7 +2017,7 @@
               <a:graphicData uri="http://schemas.openxmlformats.org/drawingml/2006/picture">
                 <pic:pic>
                   <pic:nvPicPr>
-                    <pic:cNvPr id="0" name="mac-welcome.png"/>
+                    <pic:cNvPr id="0" name="mac-security.png"/>
                     <pic:cNvPicPr/>
                   </pic:nvPicPr>
                   <pic:blipFill>
@@ -1953,7 +2029,7 @@
                   <pic:spPr>
                     <a:xfrm>
                       <a:off x="0" y="0"/>
-                      <a:ext cx="4572000" cy="3265714"/>
+                      <a:ext cx="4937760" cy="3240405"/>
                     </a:xfrm>
                     <a:prstGeom prst="rect"/>
                   </pic:spPr>
@@ -1978,7 +2054,7 @@
           <w:szCs w:val="18"/>
           <w:bCs w:val="1"/>
         </w:rPr>
-        <w:t>ภาพที่ 8  หน้าต้อนรับของตัวติดตั้ง (ภาพจำลอง)</w:t>
+        <w:t>ภาพที่ 8  System Settings → Privacy &amp; Security → Open Anyway (ภาพจำลอง)</w:t>
       </w:r>
     </w:p>
     <w:p>
@@ -1998,7 +2074,7 @@
               <a:graphicData uri="http://schemas.openxmlformats.org/drawingml/2006/picture">
                 <pic:pic>
                   <pic:nvPicPr>
-                    <pic:cNvPr id="0" name="mac-destination.png"/>
+                    <pic:cNvPr id="0" name="mac-welcome.png"/>
                     <pic:cNvPicPr/>
                   </pic:nvPicPr>
                   <pic:blipFill>
@@ -2035,7 +2111,7 @@
           <w:szCs w:val="18"/>
           <w:bCs w:val="1"/>
         </w:rPr>
-        <w:t>ภาพที่ 9  เลือกดิสก์ปลายทาง (ภาพจำลอง)</w:t>
+        <w:t>ภาพที่ 9  หน้าต้อนรับของตัวติดตั้ง (ภาพจำลอง)</w:t>
       </w:r>
     </w:p>
     <w:p>
@@ -2055,7 +2131,7 @@
               <a:graphicData uri="http://schemas.openxmlformats.org/drawingml/2006/picture">
                 <pic:pic>
                   <pic:nvPicPr>
-                    <pic:cNvPr id="0" name="mac-installing.png"/>
+                    <pic:cNvPr id="0" name="mac-destination.png"/>
                     <pic:cNvPicPr/>
                   </pic:nvPicPr>
                   <pic:blipFill>
@@ -2092,7 +2168,7 @@
           <w:szCs w:val="18"/>
           <w:bCs w:val="1"/>
         </w:rPr>
-        <w:t>ภาพที่ 10  ระหว่างติดตั้ง (ภาพจำลอง)</w:t>
+        <w:t>ภาพที่ 10  เลือกดิสก์ปลายทาง (ภาพจำลอง)</w:t>
       </w:r>
     </w:p>
     <w:p>
@@ -2112,7 +2188,7 @@
               <a:graphicData uri="http://schemas.openxmlformats.org/drawingml/2006/picture">
                 <pic:pic>
                   <pic:nvPicPr>
-                    <pic:cNvPr id="0" name="mac-summary.png"/>
+                    <pic:cNvPr id="0" name="mac-installing.png"/>
                     <pic:cNvPicPr/>
                   </pic:nvPicPr>
                   <pic:blipFill>
@@ -2149,7 +2225,64 @@
           <w:szCs w:val="18"/>
           <w:bCs w:val="1"/>
         </w:rPr>
-        <w:t>ภาพที่ 11  ติดตั้งเสร็จสมบูรณ์ (ภาพจำลอง)</w:t>
+        <w:t>ภาพที่ 11  ระหว่างติดตั้ง (ภาพจำลอง)</w:t>
+      </w:r>
+    </w:p>
+    <w:p>
+      <w:pPr>
+        <w:spacing w:before="160" w:after="40"/>
+        <w:jc w:val="center"/>
+      </w:pPr>
+      <w:r>
+        <w:drawing>
+          <wp:inline xmlns:a="http://schemas.openxmlformats.org/drawingml/2006/main" xmlns:pic="http://schemas.openxmlformats.org/drawingml/2006/picture">
+            <wp:extent cx="4572000" cy="3265714"/>
+            <wp:docPr id="12" name="Picture 12"/>
+            <wp:cNvGraphicFramePr>
+              <a:graphicFrameLocks noChangeAspect="1"/>
+            </wp:cNvGraphicFramePr>
+            <a:graphic>
+              <a:graphicData uri="http://schemas.openxmlformats.org/drawingml/2006/picture">
+                <pic:pic>
+                  <pic:nvPicPr>
+                    <pic:cNvPr id="0" name="mac-summary.png"/>
+                    <pic:cNvPicPr/>
+                  </pic:nvPicPr>
+                  <pic:blipFill>
+                    <a:blip r:embed="rId22"/>
+                    <a:stretch>
+                      <a:fillRect/>
+                    </a:stretch>
+                  </pic:blipFill>
+                  <pic:spPr>
+                    <a:xfrm>
+                      <a:off x="0" y="0"/>
+                      <a:ext cx="4572000" cy="3265714"/>
+                    </a:xfrm>
+                    <a:prstGeom prst="rect"/>
+                  </pic:spPr>
+                </pic:pic>
+              </a:graphicData>
+            </a:graphic>
+          </wp:inline>
+        </w:drawing>
+      </w:r>
+    </w:p>
+    <w:p>
+      <w:pPr>
+        <w:spacing w:before="0" w:after="200" w:line="324" w:lineRule="auto"/>
+        <w:jc w:val="center"/>
+      </w:pPr>
+      <w:r>
+        <w:rPr>
+          <w:b w:val="0"/>
+          <w:color w:val="6B7280"/>
+          <w:sz w:val="18"/>
+          <w:rFonts w:ascii="IBM Plex Sans Thai" w:hAnsi="IBM Plex Sans Thai" w:cs="IBM Plex Sans Thai"/>
+          <w:szCs w:val="18"/>
+          <w:bCs w:val="1"/>
+        </w:rPr>
+        <w:t>ภาพที่ 12  ติดตั้งเสร็จสมบูรณ์ (ภาพจำลอง)</w:t>
       </w:r>
     </w:p>
     <w:p>
@@ -2193,7 +2326,7 @@
         <w:drawing>
           <wp:inline xmlns:a="http://schemas.openxmlformats.org/drawingml/2006/main" xmlns:pic="http://schemas.openxmlformats.org/drawingml/2006/picture">
             <wp:extent cx="3474720" cy="1414130"/>
-            <wp:docPr id="12" name="Picture 12"/>
+            <wp:docPr id="13" name="Picture 13"/>
             <wp:cNvGraphicFramePr>
               <a:graphicFrameLocks noChangeAspect="1"/>
             </wp:cNvGraphicFramePr>
@@ -2205,7 +2338,7 @@
                     <pic:cNvPicPr/>
                   </pic:nvPicPr>
                   <pic:blipFill>
-                    <a:blip r:embed="rId22"/>
+                    <a:blip r:embed="rId23"/>
                     <a:stretch>
                       <a:fillRect/>
                     </a:stretch>
@@ -2238,7 +2371,7 @@
           <w:szCs w:val="18"/>
           <w:bCs w:val="1"/>
         </w:rPr>
-        <w:t>ภาพที่ 12  การขอสิทธิ์เข้าถึงกล้อง (ภาพจำลอง)</w:t>
+        <w:t>ภาพที่ 13  การขอสิทธิ์เข้าถึงกล้อง (ภาพจำลอง)</w:t>
       </w:r>
     </w:p>
     <w:p>
@@ -2870,7 +3003,7 @@
                 <w:szCs w:val="20"/>
                 <w:bCs w:val="1"/>
               </w:rPr>
-              <w:t>macOS บอกว่าเปิดแอปไม่ได้ / นักพัฒนาไม่รู้จัก</w:t>
+              <w:t>ติดตั้ง .pkg ไม่ได้ / เตือนว่า Apple ตรวจสอบแอปไม่ได้</w:t>
             </w:r>
           </w:p>
         </w:tc>
@@ -2892,7 +3025,7 @@
                 <w:szCs w:val="20"/>
                 <w:bCs w:val="1"/>
               </w:rPr>
-              <w:t>คลิกขวาที่ไฟล์ .pkg → เปิด → เปิด (ทำครั้งแรกครั้งเดียว)</w:t>
+              <w:t>กด Done แล้วไปที่ System Settings → Privacy &amp; Security เลื่อนล่างสุด → Open Anyway (ดูหัวข้อ 4)</w:t>
             </w:r>
           </w:p>
         </w:tc>

</xml_diff>

<commit_message>
docs: shorter user guide with annotated UI shots, IBM Plex Sans Thai throughout, PDF export
</commit_message>
<xml_diff>
--- a/docs/Cuptick Installation Guide - TH v1.0.docx
+++ b/docs/Cuptick Installation Guide - TH v1.0.docx
@@ -81,12 +81,12 @@
       <w:tr>
         <w:tc>
           <w:tcPr>
-            <w:tcW w:type="dxa" w:w="9360"/>
+            <w:tcW w:type="dxa" w:w="792"/>
             <w:shd w:val="clear" w:fill="0AC4C4"/>
           </w:tcPr>
           <w:p>
             <w:pPr>
-              <w:spacing w:before="40" w:after="40"/>
+              <w:spacing w:before="0" w:after="0" w:line="80" w:lineRule="exact"/>
             </w:pPr>
             <w:r/>
             <w:r>
@@ -103,21 +103,6 @@
         </w:tc>
       </w:tr>
     </w:tbl>
-    <w:p>
-      <w:pPr>
-        <w:spacing w:before="0" w:after="180" w:line="324" w:lineRule="auto"/>
-      </w:pPr>
-    </w:p>
-    <w:p>
-      <w:pPr>
-        <w:spacing w:before="0" w:after="180" w:line="324" w:lineRule="auto"/>
-      </w:pPr>
-    </w:p>
-    <w:p>
-      <w:pPr>
-        <w:spacing w:before="0" w:after="180" w:line="324" w:lineRule="auto"/>
-      </w:pPr>
-    </w:p>
     <w:p>
       <w:pPr>
         <w:spacing w:before="0" w:after="180" w:line="324" w:lineRule="auto"/>
@@ -3146,6 +3131,7 @@
     <w:pPr>
       <w:pStyle w:val="Footer"/>
       <w:tabs>
+        <w:tab w:val="clear" w:pos="4680"/>
         <w:tab w:pos="9360" w:val="right"/>
       </w:tabs>
     </w:pPr>
@@ -3175,6 +3161,12 @@
     </w:r>
     <w:fldSimple w:instr=" PAGE ">
       <w:r>
+        <w:rPr>
+          <w:color w:val="13ACAA"/>
+          <w:rFonts w:ascii="IBM Plex Sans Thai" w:hAnsi="IBM Plex Sans Thai" w:cs="IBM Plex Sans Thai"/>
+          <w:sz w:val="18"/>
+          <w:szCs w:val="18"/>
+        </w:rPr>
         <w:t>1</w:t>
       </w:r>
     </w:fldSimple>
@@ -3274,18 +3266,15 @@
         </w:tcPr>
         <w:p>
           <w:pPr>
-            <w:jc w:val="right"/>
+            <w:shd w:val="clear" w:fill="0AC4C4"/>
+            <w:spacing w:before="0" w:after="0" w:line="80" w:lineRule="exact"/>
+            <w:ind w:left="2200"/>
           </w:pPr>
           <w:r>
             <w:rPr>
-              <w:sz w:val="20"/>
-              <w:rFonts w:ascii="IBM Plex Sans Thai" w:hAnsi="IBM Plex Sans Thai" w:cs="IBM Plex Sans Thai"/>
-              <w:szCs w:val="20"/>
-              <w:bCs w:val="1"/>
-              <w:b w:val="0"/>
-              <w:shd w:val="clear" w:fill="0AC4C4"/>
+              <w:sz w:val="4"/>
             </w:rPr>
-            <w:t xml:space="preserve">        </w:t>
+            <w:t xml:space="preserve"> </w:t>
           </w:r>
         </w:p>
       </w:tc>
@@ -27188,9 +27177,9 @@
     </a:clrScheme>
     <a:fontScheme name="Office">
       <a:majorFont>
-        <a:latin typeface="Calibri"/>
-        <a:ea typeface=""/>
-        <a:cs typeface=""/>
+        <a:latin typeface="IBM Plex Sans Thai"/>
+        <a:ea typeface="IBM Plex Sans Thai"/>
+        <a:cs typeface="IBM Plex Sans Thai"/>
         <a:font script="Jpan" typeface="ＭＳ ゴシック"/>
         <a:font script="Hang" typeface="맑은 고딕"/>
         <a:font script="Hans" typeface="宋体"/>
@@ -27223,9 +27212,9 @@
         <a:font script="Geor" typeface="Sylfaen"/>
       </a:majorFont>
       <a:minorFont>
-        <a:latin typeface="Cambria"/>
-        <a:ea typeface=""/>
-        <a:cs typeface=""/>
+        <a:latin typeface="IBM Plex Sans Thai"/>
+        <a:ea typeface="IBM Plex Sans Thai"/>
+        <a:cs typeface="IBM Plex Sans Thai"/>
         <a:font script="Jpan" typeface="ＭＳ 明朝"/>
         <a:font script="Hang" typeface="맑은 고딕"/>
         <a:font script="Hans" typeface="宋体"/>

</xml_diff>